<commit_message>
#03 Maj fichier API
Ajout de l'endpoint /api/transcribe pour appeler l'IA
</commit_message>
<xml_diff>
--- a/APIs.docx
+++ b/APIs.docx
@@ -880,18 +880,7 @@
                       <w:lang w:eastAsia="fr-FR"/>
                       <w14:ligatures w14:val="none"/>
                     </w:rPr>
-                    <w:t>I</w:t>
-                  </w:r>
-                  <w:r>
-                    <w:rPr>
-                      <w:rFonts w:ascii="Arial" w:eastAsia="Times New Roman" w:hAnsi="Arial" w:cs="Arial"/>
-                      <w:kern w:val="0"/>
-                      <w:sz w:val="20"/>
-                      <w:szCs w:val="20"/>
-                      <w:lang w:eastAsia="fr-FR"/>
-                      <w14:ligatures w14:val="none"/>
-                    </w:rPr>
-                    <w:t>d_</w:t>
+                    <w:t>Id_</w:t>
                   </w:r>
                   <w:proofErr w:type="gramStart"/>
                   <w:r>
@@ -1263,29 +1252,16 @@
                       <w14:ligatures w14:val="none"/>
                     </w:rPr>
                   </w:pPr>
-                  <w:proofErr w:type="spellStart"/>
-                  <w:r>
-                    <w:rPr>
-                      <w:rFonts w:ascii="Arial" w:eastAsia="Times New Roman" w:hAnsi="Arial" w:cs="Arial"/>
-                      <w:kern w:val="0"/>
-                      <w:sz w:val="20"/>
-                      <w:szCs w:val="20"/>
-                      <w:lang w:eastAsia="fr-FR"/>
-                      <w14:ligatures w14:val="none"/>
-                    </w:rPr>
-                    <w:t>R</w:t>
-                  </w:r>
-                  <w:proofErr w:type="spellEnd"/>
-                  <w:r>
-                    <w:rPr>
-                      <w:rFonts w:ascii="Arial" w:eastAsia="Times New Roman" w:hAnsi="Arial" w:cs="Arial"/>
-                      <w:kern w:val="0"/>
-                      <w:sz w:val="20"/>
-                      <w:szCs w:val="20"/>
-                      <w:lang w:eastAsia="fr-FR"/>
-                      <w14:ligatures w14:val="none"/>
-                    </w:rPr>
-                    <w:t>etirer un participant d’une réunion</w:t>
+                  <w:r>
+                    <w:rPr>
+                      <w:rFonts w:ascii="Arial" w:eastAsia="Times New Roman" w:hAnsi="Arial" w:cs="Arial"/>
+                      <w:kern w:val="0"/>
+                      <w:sz w:val="20"/>
+                      <w:szCs w:val="20"/>
+                      <w:lang w:eastAsia="fr-FR"/>
+                      <w14:ligatures w14:val="none"/>
+                    </w:rPr>
+                    <w:t>Retirer un participant d’une réunion</w:t>
                   </w:r>
                 </w:p>
               </w:tc>
@@ -1428,18 +1404,7 @@
                       <w:lang w:eastAsia="fr-FR"/>
                       <w14:ligatures w14:val="none"/>
                     </w:rPr>
-                    <w:t>I</w:t>
-                  </w:r>
-                  <w:r>
-                    <w:rPr>
-                      <w:rFonts w:ascii="Arial" w:eastAsia="Times New Roman" w:hAnsi="Arial" w:cs="Arial"/>
-                      <w:kern w:val="0"/>
-                      <w:sz w:val="20"/>
-                      <w:szCs w:val="20"/>
-                      <w:lang w:eastAsia="fr-FR"/>
-                      <w14:ligatures w14:val="none"/>
-                    </w:rPr>
-                    <w:t>d_</w:t>
+                    <w:t>Id_</w:t>
                   </w:r>
                   <w:proofErr w:type="gramStart"/>
                   <w:r>
@@ -1759,29 +1724,14 @@
         <w:t xml:space="preserve">N°2 : </w:t>
       </w:r>
       <w:r>
-        <w:t>Transcription</w:t>
-      </w:r>
-      <w:r>
-        <w:t xml:space="preserve"> (Table </w:t>
-      </w:r>
-      <w:r>
-        <w:t>transcription</w:t>
-      </w:r>
-      <w:r>
-        <w:t xml:space="preserve"> + </w:t>
-      </w:r>
-      <w:r>
-        <w:t>locuteur + segment</w:t>
-      </w:r>
-      <w:r>
-        <w:t>)</w:t>
+        <w:t>Transcription (Table transcription + locuteur + segment)</w:t>
       </w:r>
     </w:p>
     <w:tbl>
       <w:tblPr>
         <w:tblpPr w:leftFromText="141" w:rightFromText="141" w:vertAnchor="text" w:horzAnchor="page" w:tblpX="839" w:tblpY="359"/>
         <w:tblOverlap w:val="never"/>
-        <w:tblW w:w="11052" w:type="dxa"/>
+        <w:tblW w:w="9096" w:type="dxa"/>
         <w:tblCellSpacing w:w="15" w:type="dxa"/>
         <w:tblBorders>
           <w:top w:val="single" w:sz="4" w:space="0" w:color="auto"/>
@@ -1801,10 +1751,10 @@
         <w:tblLook w:val="04A0" w:firstRow="1" w:lastRow="0" w:firstColumn="1" w:lastColumn="0" w:noHBand="0" w:noVBand="1"/>
       </w:tblPr>
       <w:tblGrid>
-        <w:gridCol w:w="576"/>
-        <w:gridCol w:w="7074"/>
-        <w:gridCol w:w="1701"/>
-        <w:gridCol w:w="1701"/>
+        <w:gridCol w:w="704"/>
+        <w:gridCol w:w="5536"/>
+        <w:gridCol w:w="1428"/>
+        <w:gridCol w:w="1428"/>
       </w:tblGrid>
       <w:tr>
         <w:trPr>
@@ -1812,25 +1762,14 @@
         </w:trPr>
         <w:tc>
           <w:tcPr>
-            <w:tcW w:w="531" w:type="dxa"/>
+            <w:tcW w:w="659" w:type="dxa"/>
             <w:vAlign w:val="center"/>
-            <w:hideMark/>
           </w:tcPr>
           <w:p>
             <w:pPr>
               <w:spacing w:before="100" w:beforeAutospacing="1" w:after="100" w:afterAutospacing="1" w:line="240" w:lineRule="auto"/>
               <w:rPr>
                 <w:rFonts w:ascii="Arial" w:eastAsia="Times New Roman" w:hAnsi="Arial" w:cs="Arial"/>
-                <w:kern w:val="0"/>
-                <w:sz w:val="20"/>
-                <w:szCs w:val="20"/>
-                <w:lang w:eastAsia="fr-FR"/>
-                <w14:ligatures w14:val="none"/>
-              </w:rPr>
-            </w:pPr>
-            <w:r>
-              <w:rPr>
-                <w:rFonts w:ascii="Arial" w:eastAsia="Times New Roman" w:hAnsi="Arial" w:cs="Arial"/>
                 <w:b/>
                 <w:bCs/>
                 <w:kern w:val="0"/>
@@ -1839,15 +1778,26 @@
                 <w:lang w:eastAsia="fr-FR"/>
                 <w14:ligatures w14:val="none"/>
               </w:rPr>
-              <w:t>GET</w:t>
+            </w:pPr>
+            <w:r>
+              <w:rPr>
+                <w:rFonts w:ascii="Arial" w:eastAsia="Times New Roman" w:hAnsi="Arial" w:cs="Arial"/>
+                <w:b/>
+                <w:bCs/>
+                <w:kern w:val="0"/>
+                <w:sz w:val="20"/>
+                <w:szCs w:val="20"/>
+                <w:lang w:eastAsia="fr-FR"/>
+                <w14:ligatures w14:val="none"/>
+              </w:rPr>
+              <w:t>POST</w:t>
             </w:r>
           </w:p>
         </w:tc>
         <w:tc>
           <w:tcPr>
-            <w:tcW w:w="7044" w:type="dxa"/>
+            <w:tcW w:w="5506" w:type="dxa"/>
             <w:vAlign w:val="center"/>
-            <w:hideMark/>
           </w:tcPr>
           <w:p>
             <w:pPr>
@@ -1870,120 +1820,27 @@
                 <w:lang w:eastAsia="fr-FR"/>
                 <w14:ligatures w14:val="none"/>
               </w:rPr>
-              <w:t>/api</w:t>
-            </w:r>
-            <w:r>
-              <w:rPr>
-                <w:rFonts w:ascii="Arial" w:eastAsia="Times New Roman" w:hAnsi="Arial" w:cs="Arial"/>
-                <w:kern w:val="0"/>
-                <w:sz w:val="20"/>
-                <w:szCs w:val="20"/>
-                <w:lang w:eastAsia="fr-FR"/>
-                <w14:ligatures w14:val="none"/>
-              </w:rPr>
-              <w:t>/transcription</w:t>
-            </w:r>
-            <w:proofErr w:type="gramStart"/>
-            <w:r>
-              <w:rPr>
-                <w:rFonts w:ascii="Arial" w:eastAsia="Times New Roman" w:hAnsi="Arial" w:cs="Arial"/>
-                <w:kern w:val="0"/>
-                <w:sz w:val="20"/>
-                <w:szCs w:val="20"/>
-                <w:lang w:eastAsia="fr-FR"/>
-                <w14:ligatures w14:val="none"/>
-              </w:rPr>
-              <w:t>/</w:t>
-            </w:r>
-            <w:r>
-              <w:rPr>
-                <w:rFonts w:ascii="Arial" w:eastAsia="Times New Roman" w:hAnsi="Arial" w:cs="Arial"/>
-                <w:kern w:val="0"/>
-                <w:sz w:val="20"/>
-                <w:szCs w:val="20"/>
-                <w:lang w:eastAsia="fr-FR"/>
-                <w14:ligatures w14:val="none"/>
-              </w:rPr>
-              <w:t>:</w:t>
-            </w:r>
-            <w:r>
-              <w:rPr>
-                <w:rFonts w:ascii="Arial" w:eastAsia="Times New Roman" w:hAnsi="Arial" w:cs="Arial"/>
-                <w:kern w:val="0"/>
-                <w:sz w:val="20"/>
-                <w:szCs w:val="20"/>
-                <w:lang w:eastAsia="fr-FR"/>
-                <w14:ligatures w14:val="none"/>
-              </w:rPr>
-              <w:t>{</w:t>
+              <w:t>/api/</w:t>
             </w:r>
             <w:proofErr w:type="spellStart"/>
-            <w:proofErr w:type="gramEnd"/>
-            <w:r>
-              <w:rPr>
-                <w:rFonts w:ascii="Arial" w:eastAsia="Times New Roman" w:hAnsi="Arial" w:cs="Arial"/>
-                <w:kern w:val="0"/>
-                <w:sz w:val="20"/>
-                <w:szCs w:val="20"/>
-                <w:lang w:eastAsia="fr-FR"/>
-                <w14:ligatures w14:val="none"/>
-              </w:rPr>
-              <w:t>Id_</w:t>
-            </w:r>
-            <w:proofErr w:type="gramStart"/>
-            <w:r>
-              <w:rPr>
-                <w:rFonts w:ascii="Arial" w:eastAsia="Times New Roman" w:hAnsi="Arial" w:cs="Arial"/>
-                <w:kern w:val="0"/>
-                <w:sz w:val="20"/>
-                <w:szCs w:val="20"/>
-                <w:lang w:eastAsia="fr-FR"/>
-                <w14:ligatures w14:val="none"/>
-              </w:rPr>
-              <w:t>reunion</w:t>
+            <w:r>
+              <w:rPr>
+                <w:rFonts w:ascii="Arial" w:eastAsia="Times New Roman" w:hAnsi="Arial" w:cs="Arial"/>
+                <w:kern w:val="0"/>
+                <w:sz w:val="20"/>
+                <w:szCs w:val="20"/>
+                <w:lang w:eastAsia="fr-FR"/>
+                <w14:ligatures w14:val="none"/>
+              </w:rPr>
+              <w:t>transcribe</w:t>
             </w:r>
             <w:proofErr w:type="spellEnd"/>
-            <w:r>
-              <w:rPr>
-                <w:rFonts w:ascii="Arial" w:eastAsia="Times New Roman" w:hAnsi="Arial" w:cs="Arial"/>
-                <w:kern w:val="0"/>
-                <w:sz w:val="20"/>
-                <w:szCs w:val="20"/>
-                <w:lang w:eastAsia="fr-FR"/>
-                <w14:ligatures w14:val="none"/>
-              </w:rPr>
-              <w:t>}/</w:t>
-            </w:r>
-            <w:proofErr w:type="gramEnd"/>
-            <w:r>
-              <w:rPr>
-                <w:rFonts w:ascii="Arial" w:eastAsia="Times New Roman" w:hAnsi="Arial" w:cs="Arial"/>
-                <w:kern w:val="0"/>
-                <w:sz w:val="20"/>
-                <w:szCs w:val="20"/>
-                <w:lang w:eastAsia="fr-FR"/>
-                <w14:ligatures w14:val="none"/>
-              </w:rPr>
-              <w:t>segment</w:t>
-            </w:r>
-            <w:r>
-              <w:rPr>
-                <w:rFonts w:ascii="Arial" w:eastAsia="Times New Roman" w:hAnsi="Arial" w:cs="Arial"/>
-                <w:kern w:val="0"/>
-                <w:sz w:val="20"/>
-                <w:szCs w:val="20"/>
-                <w:lang w:eastAsia="fr-FR"/>
-                <w14:ligatures w14:val="none"/>
-              </w:rPr>
-              <w:t>/all</w:t>
-            </w:r>
           </w:p>
         </w:tc>
         <w:tc>
           <w:tcPr>
-            <w:tcW w:w="1671" w:type="dxa"/>
+            <w:tcW w:w="1398" w:type="dxa"/>
             <w:vAlign w:val="center"/>
-            <w:hideMark/>
           </w:tcPr>
           <w:p>
             <w:pPr>
@@ -2006,24 +1863,13 @@
                 <w:lang w:eastAsia="fr-FR"/>
                 <w14:ligatures w14:val="none"/>
               </w:rPr>
-              <w:t>Lister les segments de la transcription</w:t>
-            </w:r>
-            <w:r>
-              <w:rPr>
-                <w:rFonts w:ascii="Arial" w:eastAsia="Times New Roman" w:hAnsi="Arial" w:cs="Arial"/>
-                <w:kern w:val="0"/>
-                <w:sz w:val="20"/>
-                <w:szCs w:val="20"/>
-                <w:lang w:eastAsia="fr-FR"/>
-                <w14:ligatures w14:val="none"/>
-              </w:rPr>
-              <w:t xml:space="preserve"> pour reconstruire la synthèse</w:t>
+              <w:t>Envoyer l’audio à l’IA pour la transcription</w:t>
             </w:r>
           </w:p>
         </w:tc>
         <w:tc>
           <w:tcPr>
-            <w:tcW w:w="1656" w:type="dxa"/>
+            <w:tcW w:w="1383" w:type="dxa"/>
             <w:vAlign w:val="center"/>
           </w:tcPr>
           <w:p>
@@ -2048,7 +1894,7 @@
                 <w:lang w:eastAsia="fr-FR"/>
                 <w14:ligatures w14:val="none"/>
               </w:rPr>
-              <w:t>200 + All segments</w:t>
+              <w:t>201 + Transcribe</w:t>
             </w:r>
           </w:p>
         </w:tc>
@@ -2059,7 +1905,7 @@
         </w:trPr>
         <w:tc>
           <w:tcPr>
-            <w:tcW w:w="531" w:type="dxa"/>
+            <w:tcW w:w="659" w:type="dxa"/>
             <w:vAlign w:val="center"/>
             <w:hideMark/>
           </w:tcPr>
@@ -2092,7 +1938,7 @@
         </w:tc>
         <w:tc>
           <w:tcPr>
-            <w:tcW w:w="7044" w:type="dxa"/>
+            <w:tcW w:w="5506" w:type="dxa"/>
             <w:vAlign w:val="center"/>
             <w:hideMark/>
           </w:tcPr>
@@ -2213,92 +2059,22 @@
               </w:rPr>
               <w:t>segment</w:t>
             </w:r>
-            <w:proofErr w:type="gramStart"/>
-            <w:r>
-              <w:rPr>
-                <w:rFonts w:ascii="Arial" w:eastAsia="Times New Roman" w:hAnsi="Arial" w:cs="Arial"/>
-                <w:kern w:val="0"/>
-                <w:sz w:val="20"/>
-                <w:szCs w:val="20"/>
-                <w:lang w:eastAsia="fr-FR"/>
-                <w14:ligatures w14:val="none"/>
-              </w:rPr>
-              <w:t>/</w:t>
-            </w:r>
-            <w:r>
-              <w:rPr>
-                <w:rFonts w:ascii="Arial" w:eastAsia="Times New Roman" w:hAnsi="Arial" w:cs="Arial"/>
-                <w:kern w:val="0"/>
-                <w:sz w:val="20"/>
-                <w:szCs w:val="20"/>
-                <w:lang w:eastAsia="fr-FR"/>
-                <w14:ligatures w14:val="none"/>
-              </w:rPr>
-              <w:t>:</w:t>
-            </w:r>
-            <w:r>
-              <w:rPr>
-                <w:rFonts w:ascii="Arial" w:eastAsia="Times New Roman" w:hAnsi="Arial" w:cs="Arial"/>
-                <w:kern w:val="0"/>
-                <w:sz w:val="20"/>
-                <w:szCs w:val="20"/>
-                <w:lang w:eastAsia="fr-FR"/>
-                <w14:ligatures w14:val="none"/>
-              </w:rPr>
-              <w:t>{</w:t>
-            </w:r>
-            <w:proofErr w:type="spellStart"/>
-            <w:proofErr w:type="gramEnd"/>
-            <w:r>
-              <w:rPr>
-                <w:rFonts w:ascii="Arial" w:eastAsia="Times New Roman" w:hAnsi="Arial" w:cs="Arial"/>
-                <w:kern w:val="0"/>
-                <w:sz w:val="20"/>
-                <w:szCs w:val="20"/>
-                <w:lang w:eastAsia="fr-FR"/>
-                <w14:ligatures w14:val="none"/>
-              </w:rPr>
-              <w:t>I</w:t>
-            </w:r>
-            <w:r>
-              <w:rPr>
-                <w:rFonts w:ascii="Arial" w:eastAsia="Times New Roman" w:hAnsi="Arial" w:cs="Arial"/>
-                <w:kern w:val="0"/>
-                <w:sz w:val="20"/>
-                <w:szCs w:val="20"/>
-                <w:lang w:eastAsia="fr-FR"/>
-                <w14:ligatures w14:val="none"/>
-              </w:rPr>
-              <w:t>d</w:t>
-            </w:r>
-            <w:r>
-              <w:rPr>
-                <w:rFonts w:ascii="Arial" w:eastAsia="Times New Roman" w:hAnsi="Arial" w:cs="Arial"/>
-                <w:kern w:val="0"/>
-                <w:sz w:val="20"/>
-                <w:szCs w:val="20"/>
-                <w:lang w:eastAsia="fr-FR"/>
-                <w14:ligatures w14:val="none"/>
-              </w:rPr>
-              <w:t>_segment</w:t>
-            </w:r>
-            <w:proofErr w:type="spellEnd"/>
-            <w:r>
-              <w:rPr>
-                <w:rFonts w:ascii="Arial" w:eastAsia="Times New Roman" w:hAnsi="Arial" w:cs="Arial"/>
-                <w:kern w:val="0"/>
-                <w:sz w:val="20"/>
-                <w:szCs w:val="20"/>
-                <w:lang w:eastAsia="fr-FR"/>
-                <w14:ligatures w14:val="none"/>
-              </w:rPr>
-              <w:t>}</w:t>
+            <w:r>
+              <w:rPr>
+                <w:rFonts w:ascii="Arial" w:eastAsia="Times New Roman" w:hAnsi="Arial" w:cs="Arial"/>
+                <w:kern w:val="0"/>
+                <w:sz w:val="20"/>
+                <w:szCs w:val="20"/>
+                <w:lang w:eastAsia="fr-FR"/>
+                <w14:ligatures w14:val="none"/>
+              </w:rPr>
+              <w:t>/all</w:t>
             </w:r>
           </w:p>
         </w:tc>
         <w:tc>
           <w:tcPr>
-            <w:tcW w:w="1671" w:type="dxa"/>
+            <w:tcW w:w="1398" w:type="dxa"/>
             <w:vAlign w:val="center"/>
             <w:hideMark/>
           </w:tcPr>
@@ -2323,35 +2099,24 @@
                 <w:lang w:eastAsia="fr-FR"/>
                 <w14:ligatures w14:val="none"/>
               </w:rPr>
-              <w:t xml:space="preserve">Obtenir </w:t>
-            </w:r>
-            <w:r>
-              <w:rPr>
-                <w:rFonts w:ascii="Arial" w:eastAsia="Times New Roman" w:hAnsi="Arial" w:cs="Arial"/>
-                <w:kern w:val="0"/>
-                <w:sz w:val="20"/>
-                <w:szCs w:val="20"/>
-                <w:lang w:eastAsia="fr-FR"/>
-                <w14:ligatures w14:val="none"/>
-              </w:rPr>
-              <w:t>un</w:t>
-            </w:r>
-            <w:r>
-              <w:rPr>
-                <w:rFonts w:ascii="Arial" w:eastAsia="Times New Roman" w:hAnsi="Arial" w:cs="Arial"/>
-                <w:kern w:val="0"/>
-                <w:sz w:val="20"/>
-                <w:szCs w:val="20"/>
-                <w:lang w:eastAsia="fr-FR"/>
-                <w14:ligatures w14:val="none"/>
-              </w:rPr>
-              <w:t xml:space="preserve"> segment spécifique</w:t>
+              <w:t>Lister les segments de la transcription</w:t>
+            </w:r>
+            <w:r>
+              <w:rPr>
+                <w:rFonts w:ascii="Arial" w:eastAsia="Times New Roman" w:hAnsi="Arial" w:cs="Arial"/>
+                <w:kern w:val="0"/>
+                <w:sz w:val="20"/>
+                <w:szCs w:val="20"/>
+                <w:lang w:eastAsia="fr-FR"/>
+                <w14:ligatures w14:val="none"/>
+              </w:rPr>
+              <w:t xml:space="preserve"> pour reconstruire la synthèse</w:t>
             </w:r>
           </w:p>
         </w:tc>
         <w:tc>
           <w:tcPr>
-            <w:tcW w:w="1656" w:type="dxa"/>
+            <w:tcW w:w="1383" w:type="dxa"/>
             <w:vAlign w:val="center"/>
           </w:tcPr>
           <w:p>
@@ -2376,7 +2141,7 @@
                 <w:lang w:eastAsia="fr-FR"/>
                 <w14:ligatures w14:val="none"/>
               </w:rPr>
-              <w:t>200 + Segment</w:t>
+              <w:t>200 + All segments</w:t>
             </w:r>
           </w:p>
         </w:tc>
@@ -2387,14 +2152,25 @@
         </w:trPr>
         <w:tc>
           <w:tcPr>
-            <w:tcW w:w="531" w:type="dxa"/>
+            <w:tcW w:w="659" w:type="dxa"/>
             <w:vAlign w:val="center"/>
+            <w:hideMark/>
           </w:tcPr>
           <w:p>
             <w:pPr>
               <w:spacing w:before="100" w:beforeAutospacing="1" w:after="100" w:afterAutospacing="1" w:line="240" w:lineRule="auto"/>
               <w:rPr>
                 <w:rFonts w:ascii="Arial" w:eastAsia="Times New Roman" w:hAnsi="Arial" w:cs="Arial"/>
+                <w:kern w:val="0"/>
+                <w:sz w:val="20"/>
+                <w:szCs w:val="20"/>
+                <w:lang w:eastAsia="fr-FR"/>
+                <w14:ligatures w14:val="none"/>
+              </w:rPr>
+            </w:pPr>
+            <w:r>
+              <w:rPr>
+                <w:rFonts w:ascii="Arial" w:eastAsia="Times New Roman" w:hAnsi="Arial" w:cs="Arial"/>
                 <w:b/>
                 <w:bCs/>
                 <w:kern w:val="0"/>
@@ -2403,26 +2179,15 @@
                 <w:lang w:eastAsia="fr-FR"/>
                 <w14:ligatures w14:val="none"/>
               </w:rPr>
-            </w:pPr>
-            <w:r>
-              <w:rPr>
-                <w:rFonts w:ascii="Arial" w:eastAsia="Times New Roman" w:hAnsi="Arial" w:cs="Arial"/>
-                <w:b/>
-                <w:bCs/>
-                <w:kern w:val="0"/>
-                <w:sz w:val="20"/>
-                <w:szCs w:val="20"/>
-                <w:lang w:eastAsia="fr-FR"/>
-                <w14:ligatures w14:val="none"/>
-              </w:rPr>
-              <w:t>PUT</w:t>
+              <w:t>GET</w:t>
             </w:r>
           </w:p>
         </w:tc>
         <w:tc>
           <w:tcPr>
-            <w:tcW w:w="7044" w:type="dxa"/>
+            <w:tcW w:w="5506" w:type="dxa"/>
             <w:vAlign w:val="center"/>
+            <w:hideMark/>
           </w:tcPr>
           <w:p>
             <w:pPr>
@@ -2626,8 +2391,9 @@
         </w:tc>
         <w:tc>
           <w:tcPr>
-            <w:tcW w:w="1671" w:type="dxa"/>
+            <w:tcW w:w="1398" w:type="dxa"/>
             <w:vAlign w:val="center"/>
+            <w:hideMark/>
           </w:tcPr>
           <w:p>
             <w:pPr>
@@ -2650,29 +2416,18 @@
                 <w:lang w:eastAsia="fr-FR"/>
                 <w14:ligatures w14:val="none"/>
               </w:rPr>
-              <w:t>Modifier le texte</w:t>
-            </w:r>
-            <w:r>
-              <w:rPr>
-                <w:rFonts w:ascii="Arial" w:eastAsia="Times New Roman" w:hAnsi="Arial" w:cs="Arial"/>
-                <w:kern w:val="0"/>
-                <w:sz w:val="20"/>
-                <w:szCs w:val="20"/>
-                <w:lang w:eastAsia="fr-FR"/>
-                <w14:ligatures w14:val="none"/>
-              </w:rPr>
-              <w:t xml:space="preserve"> </w:t>
-            </w:r>
-            <w:r>
-              <w:rPr>
-                <w:rFonts w:ascii="Arial" w:eastAsia="Times New Roman" w:hAnsi="Arial" w:cs="Arial"/>
-                <w:kern w:val="0"/>
-                <w:sz w:val="20"/>
-                <w:szCs w:val="20"/>
-                <w:lang w:eastAsia="fr-FR"/>
-                <w14:ligatures w14:val="none"/>
-              </w:rPr>
-              <w:t>d’un</w:t>
+              <w:t xml:space="preserve">Obtenir </w:t>
+            </w:r>
+            <w:r>
+              <w:rPr>
+                <w:rFonts w:ascii="Arial" w:eastAsia="Times New Roman" w:hAnsi="Arial" w:cs="Arial"/>
+                <w:kern w:val="0"/>
+                <w:sz w:val="20"/>
+                <w:szCs w:val="20"/>
+                <w:lang w:eastAsia="fr-FR"/>
+                <w14:ligatures w14:val="none"/>
+              </w:rPr>
+              <w:t>un</w:t>
             </w:r>
             <w:r>
               <w:rPr>
@@ -2689,7 +2444,7 @@
         </w:tc>
         <w:tc>
           <w:tcPr>
-            <w:tcW w:w="1656" w:type="dxa"/>
+            <w:tcW w:w="1383" w:type="dxa"/>
             <w:vAlign w:val="center"/>
           </w:tcPr>
           <w:p>
@@ -2714,31 +2469,7 @@
                 <w:lang w:eastAsia="fr-FR"/>
                 <w14:ligatures w14:val="none"/>
               </w:rPr>
-              <w:t xml:space="preserve">202 + </w:t>
-            </w:r>
-            <w:proofErr w:type="spellStart"/>
-            <w:r>
-              <w:rPr>
-                <w:rFonts w:ascii="Arial" w:eastAsia="Times New Roman" w:hAnsi="Arial" w:cs="Arial"/>
-                <w:kern w:val="0"/>
-                <w:sz w:val="20"/>
-                <w:szCs w:val="20"/>
-                <w:lang w:eastAsia="fr-FR"/>
-                <w14:ligatures w14:val="none"/>
-              </w:rPr>
-              <w:t>Modif</w:t>
-            </w:r>
-            <w:proofErr w:type="spellEnd"/>
-            <w:r>
-              <w:rPr>
-                <w:rFonts w:ascii="Arial" w:eastAsia="Times New Roman" w:hAnsi="Arial" w:cs="Arial"/>
-                <w:kern w:val="0"/>
-                <w:sz w:val="20"/>
-                <w:szCs w:val="20"/>
-                <w:lang w:eastAsia="fr-FR"/>
-                <w14:ligatures w14:val="none"/>
-              </w:rPr>
-              <w:t xml:space="preserve"> texte</w:t>
+              <w:t>200 + Segment</w:t>
             </w:r>
           </w:p>
         </w:tc>
@@ -2749,25 +2480,14 @@
         </w:trPr>
         <w:tc>
           <w:tcPr>
-            <w:tcW w:w="531" w:type="dxa"/>
+            <w:tcW w:w="659" w:type="dxa"/>
             <w:vAlign w:val="center"/>
-            <w:hideMark/>
           </w:tcPr>
           <w:p>
             <w:pPr>
               <w:spacing w:before="100" w:beforeAutospacing="1" w:after="100" w:afterAutospacing="1" w:line="240" w:lineRule="auto"/>
               <w:rPr>
                 <w:rFonts w:ascii="Arial" w:eastAsia="Times New Roman" w:hAnsi="Arial" w:cs="Arial"/>
-                <w:kern w:val="0"/>
-                <w:sz w:val="20"/>
-                <w:szCs w:val="20"/>
-                <w:lang w:eastAsia="fr-FR"/>
-                <w14:ligatures w14:val="none"/>
-              </w:rPr>
-            </w:pPr>
-            <w:r>
-              <w:rPr>
-                <w:rFonts w:ascii="Arial" w:eastAsia="Times New Roman" w:hAnsi="Arial" w:cs="Arial"/>
                 <w:b/>
                 <w:bCs/>
                 <w:kern w:val="0"/>
@@ -2776,15 +2496,26 @@
                 <w:lang w:eastAsia="fr-FR"/>
                 <w14:ligatures w14:val="none"/>
               </w:rPr>
-              <w:t>GET</w:t>
+            </w:pPr>
+            <w:r>
+              <w:rPr>
+                <w:rFonts w:ascii="Arial" w:eastAsia="Times New Roman" w:hAnsi="Arial" w:cs="Arial"/>
+                <w:b/>
+                <w:bCs/>
+                <w:kern w:val="0"/>
+                <w:sz w:val="20"/>
+                <w:szCs w:val="20"/>
+                <w:lang w:eastAsia="fr-FR"/>
+                <w14:ligatures w14:val="none"/>
+              </w:rPr>
+              <w:t>PUT</w:t>
             </w:r>
           </w:p>
         </w:tc>
         <w:tc>
           <w:tcPr>
-            <w:tcW w:w="7044" w:type="dxa"/>
+            <w:tcW w:w="5506" w:type="dxa"/>
             <w:vAlign w:val="center"/>
-            <w:hideMark/>
           </w:tcPr>
           <w:p>
             <w:pPr>
@@ -2854,6 +2585,7 @@
               </w:rPr>
               <w:t>{</w:t>
             </w:r>
+            <w:proofErr w:type="spellStart"/>
             <w:proofErr w:type="gramEnd"/>
             <w:r>
               <w:rPr>
@@ -2878,6 +2610,7 @@
               </w:rPr>
               <w:t>reunion</w:t>
             </w:r>
+            <w:proofErr w:type="spellEnd"/>
             <w:r>
               <w:rPr>
                 <w:rFonts w:ascii="Arial" w:eastAsia="Times New Roman" w:hAnsi="Arial" w:cs="Arial"/>
@@ -2935,6 +2668,7 @@
               </w:rPr>
               <w:t>{</w:t>
             </w:r>
+            <w:proofErr w:type="spellStart"/>
             <w:proofErr w:type="gramEnd"/>
             <w:r>
               <w:rPr>
@@ -2945,61 +2679,48 @@
                 <w:lang w:eastAsia="fr-FR"/>
                 <w14:ligatures w14:val="none"/>
               </w:rPr>
-              <w:t>Id_</w:t>
-            </w:r>
-            <w:proofErr w:type="gramStart"/>
-            <w:r>
-              <w:rPr>
-                <w:rFonts w:ascii="Arial" w:eastAsia="Times New Roman" w:hAnsi="Arial" w:cs="Arial"/>
-                <w:kern w:val="0"/>
-                <w:sz w:val="20"/>
-                <w:szCs w:val="20"/>
-                <w:lang w:eastAsia="fr-FR"/>
-                <w14:ligatures w14:val="none"/>
-              </w:rPr>
-              <w:t>segment</w:t>
-            </w:r>
-            <w:r>
-              <w:rPr>
-                <w:rFonts w:ascii="Arial" w:eastAsia="Times New Roman" w:hAnsi="Arial" w:cs="Arial"/>
-                <w:kern w:val="0"/>
-                <w:sz w:val="20"/>
-                <w:szCs w:val="20"/>
-                <w:lang w:eastAsia="fr-FR"/>
-                <w14:ligatures w14:val="none"/>
-              </w:rPr>
-              <w:t>}/</w:t>
-            </w:r>
-            <w:proofErr w:type="gramEnd"/>
-            <w:r>
-              <w:rPr>
-                <w:rFonts w:ascii="Arial" w:eastAsia="Times New Roman" w:hAnsi="Arial" w:cs="Arial"/>
-                <w:kern w:val="0"/>
-                <w:sz w:val="20"/>
-                <w:szCs w:val="20"/>
-                <w:lang w:eastAsia="fr-FR"/>
-                <w14:ligatures w14:val="none"/>
-              </w:rPr>
-              <w:t>locuteur</w:t>
-            </w:r>
-            <w:r>
-              <w:rPr>
-                <w:rFonts w:ascii="Arial" w:eastAsia="Times New Roman" w:hAnsi="Arial" w:cs="Arial"/>
-                <w:kern w:val="0"/>
-                <w:sz w:val="20"/>
-                <w:szCs w:val="20"/>
-                <w:lang w:eastAsia="fr-FR"/>
-                <w14:ligatures w14:val="none"/>
-              </w:rPr>
-              <w:t>/all</w:t>
+              <w:t>I</w:t>
+            </w:r>
+            <w:r>
+              <w:rPr>
+                <w:rFonts w:ascii="Arial" w:eastAsia="Times New Roman" w:hAnsi="Arial" w:cs="Arial"/>
+                <w:kern w:val="0"/>
+                <w:sz w:val="20"/>
+                <w:szCs w:val="20"/>
+                <w:lang w:eastAsia="fr-FR"/>
+                <w14:ligatures w14:val="none"/>
+              </w:rPr>
+              <w:t>d</w:t>
+            </w:r>
+            <w:r>
+              <w:rPr>
+                <w:rFonts w:ascii="Arial" w:eastAsia="Times New Roman" w:hAnsi="Arial" w:cs="Arial"/>
+                <w:kern w:val="0"/>
+                <w:sz w:val="20"/>
+                <w:szCs w:val="20"/>
+                <w:lang w:eastAsia="fr-FR"/>
+                <w14:ligatures w14:val="none"/>
+              </w:rPr>
+              <w:t>_segment</w:t>
+            </w:r>
+            <w:proofErr w:type="spellEnd"/>
+            <w:r>
+              <w:rPr>
+                <w:rFonts w:ascii="Arial" w:eastAsia="Times New Roman" w:hAnsi="Arial" w:cs="Arial"/>
+                <w:kern w:val="0"/>
+                <w:sz w:val="20"/>
+                <w:szCs w:val="20"/>
+                <w:lang w:eastAsia="fr-FR"/>
+                <w14:ligatures w14:val="none"/>
+              </w:rPr>
+              <w:t>}</w:t>
             </w:r>
           </w:p>
         </w:tc>
         <w:tc>
           <w:tcPr>
-            <w:tcW w:w="1671" w:type="dxa"/>
+            <w:tcW w:w="1398" w:type="dxa"/>
             <w:vAlign w:val="center"/>
-            <w:hideMark/>
           </w:tcPr>
           <w:p>
             <w:pPr>
@@ -3022,13 +2743,46 @@
                 <w:lang w:eastAsia="fr-FR"/>
                 <w14:ligatures w14:val="none"/>
               </w:rPr>
-              <w:t>Lister les locuteurs d’un segment</w:t>
+              <w:t>Modifier le texte</w:t>
+            </w:r>
+            <w:r>
+              <w:rPr>
+                <w:rFonts w:ascii="Arial" w:eastAsia="Times New Roman" w:hAnsi="Arial" w:cs="Arial"/>
+                <w:kern w:val="0"/>
+                <w:sz w:val="20"/>
+                <w:szCs w:val="20"/>
+                <w:lang w:eastAsia="fr-FR"/>
+                <w14:ligatures w14:val="none"/>
+              </w:rPr>
+              <w:t xml:space="preserve"> </w:t>
+            </w:r>
+            <w:r>
+              <w:rPr>
+                <w:rFonts w:ascii="Arial" w:eastAsia="Times New Roman" w:hAnsi="Arial" w:cs="Arial"/>
+                <w:kern w:val="0"/>
+                <w:sz w:val="20"/>
+                <w:szCs w:val="20"/>
+                <w:lang w:eastAsia="fr-FR"/>
+                <w14:ligatures w14:val="none"/>
+              </w:rPr>
+              <w:t>d’un</w:t>
+            </w:r>
+            <w:r>
+              <w:rPr>
+                <w:rFonts w:ascii="Arial" w:eastAsia="Times New Roman" w:hAnsi="Arial" w:cs="Arial"/>
+                <w:kern w:val="0"/>
+                <w:sz w:val="20"/>
+                <w:szCs w:val="20"/>
+                <w:lang w:eastAsia="fr-FR"/>
+                <w14:ligatures w14:val="none"/>
+              </w:rPr>
+              <w:t xml:space="preserve"> segment spécifique</w:t>
             </w:r>
           </w:p>
         </w:tc>
         <w:tc>
           <w:tcPr>
-            <w:tcW w:w="1656" w:type="dxa"/>
+            <w:tcW w:w="1383" w:type="dxa"/>
             <w:vAlign w:val="center"/>
           </w:tcPr>
           <w:p>
@@ -3053,7 +2807,31 @@
                 <w:lang w:eastAsia="fr-FR"/>
                 <w14:ligatures w14:val="none"/>
               </w:rPr>
-              <w:t>200 + Locuteurs</w:t>
+              <w:t xml:space="preserve">202 + </w:t>
+            </w:r>
+            <w:proofErr w:type="spellStart"/>
+            <w:r>
+              <w:rPr>
+                <w:rFonts w:ascii="Arial" w:eastAsia="Times New Roman" w:hAnsi="Arial" w:cs="Arial"/>
+                <w:kern w:val="0"/>
+                <w:sz w:val="20"/>
+                <w:szCs w:val="20"/>
+                <w:lang w:eastAsia="fr-FR"/>
+                <w14:ligatures w14:val="none"/>
+              </w:rPr>
+              <w:t>Modif</w:t>
+            </w:r>
+            <w:proofErr w:type="spellEnd"/>
+            <w:r>
+              <w:rPr>
+                <w:rFonts w:ascii="Arial" w:eastAsia="Times New Roman" w:hAnsi="Arial" w:cs="Arial"/>
+                <w:kern w:val="0"/>
+                <w:sz w:val="20"/>
+                <w:szCs w:val="20"/>
+                <w:lang w:eastAsia="fr-FR"/>
+                <w14:ligatures w14:val="none"/>
+              </w:rPr>
+              <w:t xml:space="preserve"> texte</w:t>
             </w:r>
           </w:p>
         </w:tc>
@@ -3064,14 +2842,25 @@
         </w:trPr>
         <w:tc>
           <w:tcPr>
-            <w:tcW w:w="531" w:type="dxa"/>
+            <w:tcW w:w="659" w:type="dxa"/>
             <w:vAlign w:val="center"/>
+            <w:hideMark/>
           </w:tcPr>
           <w:p>
             <w:pPr>
               <w:spacing w:before="100" w:beforeAutospacing="1" w:after="100" w:afterAutospacing="1" w:line="240" w:lineRule="auto"/>
               <w:rPr>
                 <w:rFonts w:ascii="Arial" w:eastAsia="Times New Roman" w:hAnsi="Arial" w:cs="Arial"/>
+                <w:kern w:val="0"/>
+                <w:sz w:val="20"/>
+                <w:szCs w:val="20"/>
+                <w:lang w:eastAsia="fr-FR"/>
+                <w14:ligatures w14:val="none"/>
+              </w:rPr>
+            </w:pPr>
+            <w:r>
+              <w:rPr>
+                <w:rFonts w:ascii="Arial" w:eastAsia="Times New Roman" w:hAnsi="Arial" w:cs="Arial"/>
                 <w:b/>
                 <w:bCs/>
                 <w:kern w:val="0"/>
@@ -3080,26 +2869,15 @@
                 <w:lang w:eastAsia="fr-FR"/>
                 <w14:ligatures w14:val="none"/>
               </w:rPr>
-            </w:pPr>
-            <w:r>
-              <w:rPr>
-                <w:rFonts w:ascii="Arial" w:eastAsia="Times New Roman" w:hAnsi="Arial" w:cs="Arial"/>
-                <w:b/>
-                <w:bCs/>
-                <w:kern w:val="0"/>
-                <w:sz w:val="20"/>
-                <w:szCs w:val="20"/>
-                <w:lang w:eastAsia="fr-FR"/>
-                <w14:ligatures w14:val="none"/>
-              </w:rPr>
-              <w:t>PUT</w:t>
+              <w:t>GET</w:t>
             </w:r>
           </w:p>
         </w:tc>
         <w:tc>
           <w:tcPr>
-            <w:tcW w:w="7044" w:type="dxa"/>
+            <w:tcW w:w="5506" w:type="dxa"/>
             <w:vAlign w:val="center"/>
+            <w:hideMark/>
           </w:tcPr>
           <w:p>
             <w:pPr>
@@ -3297,69 +3075,24 @@
               </w:rPr>
               <w:t>locuteur</w:t>
             </w:r>
-            <w:proofErr w:type="gramStart"/>
-            <w:r>
-              <w:rPr>
-                <w:rFonts w:ascii="Arial" w:eastAsia="Times New Roman" w:hAnsi="Arial" w:cs="Arial"/>
-                <w:kern w:val="0"/>
-                <w:sz w:val="20"/>
-                <w:szCs w:val="20"/>
-                <w:lang w:eastAsia="fr-FR"/>
-                <w14:ligatures w14:val="none"/>
-              </w:rPr>
-              <w:t>/</w:t>
-            </w:r>
-            <w:r>
-              <w:rPr>
-                <w:rFonts w:ascii="Arial" w:eastAsia="Times New Roman" w:hAnsi="Arial" w:cs="Arial"/>
-                <w:kern w:val="0"/>
-                <w:sz w:val="20"/>
-                <w:szCs w:val="20"/>
-                <w:lang w:eastAsia="fr-FR"/>
-                <w14:ligatures w14:val="none"/>
-              </w:rPr>
-              <w:t>:</w:t>
-            </w:r>
-            <w:r>
-              <w:rPr>
-                <w:rFonts w:ascii="Arial" w:eastAsia="Times New Roman" w:hAnsi="Arial" w:cs="Arial"/>
-                <w:kern w:val="0"/>
-                <w:sz w:val="20"/>
-                <w:szCs w:val="20"/>
-                <w:lang w:eastAsia="fr-FR"/>
-                <w14:ligatures w14:val="none"/>
-              </w:rPr>
-              <w:t>{</w:t>
-            </w:r>
-            <w:proofErr w:type="gramEnd"/>
-            <w:r>
-              <w:rPr>
-                <w:rFonts w:ascii="Arial" w:eastAsia="Times New Roman" w:hAnsi="Arial" w:cs="Arial"/>
-                <w:kern w:val="0"/>
-                <w:sz w:val="20"/>
-                <w:szCs w:val="20"/>
-                <w:lang w:eastAsia="fr-FR"/>
-                <w14:ligatures w14:val="none"/>
-              </w:rPr>
-              <w:t>Id_participant</w:t>
-            </w:r>
-            <w:r>
-              <w:rPr>
-                <w:rFonts w:ascii="Arial" w:eastAsia="Times New Roman" w:hAnsi="Arial" w:cs="Arial"/>
-                <w:kern w:val="0"/>
-                <w:sz w:val="20"/>
-                <w:szCs w:val="20"/>
-                <w:lang w:eastAsia="fr-FR"/>
-                <w14:ligatures w14:val="none"/>
-              </w:rPr>
-              <w:t>}</w:t>
+            <w:r>
+              <w:rPr>
+                <w:rFonts w:ascii="Arial" w:eastAsia="Times New Roman" w:hAnsi="Arial" w:cs="Arial"/>
+                <w:kern w:val="0"/>
+                <w:sz w:val="20"/>
+                <w:szCs w:val="20"/>
+                <w:lang w:eastAsia="fr-FR"/>
+                <w14:ligatures w14:val="none"/>
+              </w:rPr>
+              <w:t>/all</w:t>
             </w:r>
           </w:p>
         </w:tc>
         <w:tc>
           <w:tcPr>
-            <w:tcW w:w="1671" w:type="dxa"/>
+            <w:tcW w:w="1398" w:type="dxa"/>
             <w:vAlign w:val="center"/>
+            <w:hideMark/>
           </w:tcPr>
           <w:p>
             <w:pPr>
@@ -3382,13 +3115,13 @@
                 <w:lang w:eastAsia="fr-FR"/>
                 <w14:ligatures w14:val="none"/>
               </w:rPr>
-              <w:t>Modifier le locuteur d’un segment défini par défaut par l’IA.</w:t>
+              <w:t>Lister les locuteurs d’un segment</w:t>
             </w:r>
           </w:p>
         </w:tc>
         <w:tc>
           <w:tcPr>
-            <w:tcW w:w="1656" w:type="dxa"/>
+            <w:tcW w:w="1383" w:type="dxa"/>
             <w:vAlign w:val="center"/>
           </w:tcPr>
           <w:p>
@@ -3413,31 +3146,7 @@
                 <w:lang w:eastAsia="fr-FR"/>
                 <w14:ligatures w14:val="none"/>
               </w:rPr>
-              <w:t xml:space="preserve">202 + </w:t>
-            </w:r>
-            <w:proofErr w:type="spellStart"/>
-            <w:r>
-              <w:rPr>
-                <w:rFonts w:ascii="Arial" w:eastAsia="Times New Roman" w:hAnsi="Arial" w:cs="Arial"/>
-                <w:kern w:val="0"/>
-                <w:sz w:val="20"/>
-                <w:szCs w:val="20"/>
-                <w:lang w:eastAsia="fr-FR"/>
-                <w14:ligatures w14:val="none"/>
-              </w:rPr>
-              <w:t>Modif</w:t>
-            </w:r>
-            <w:proofErr w:type="spellEnd"/>
-            <w:r>
-              <w:rPr>
-                <w:rFonts w:ascii="Arial" w:eastAsia="Times New Roman" w:hAnsi="Arial" w:cs="Arial"/>
-                <w:kern w:val="0"/>
-                <w:sz w:val="20"/>
-                <w:szCs w:val="20"/>
-                <w:lang w:eastAsia="fr-FR"/>
-                <w14:ligatures w14:val="none"/>
-              </w:rPr>
-              <w:t xml:space="preserve"> locuteur</w:t>
+              <w:t>200 + Locuteurs</w:t>
             </w:r>
           </w:p>
         </w:tc>
@@ -3448,25 +3157,14 @@
         </w:trPr>
         <w:tc>
           <w:tcPr>
-            <w:tcW w:w="531" w:type="dxa"/>
+            <w:tcW w:w="659" w:type="dxa"/>
             <w:vAlign w:val="center"/>
-            <w:hideMark/>
           </w:tcPr>
           <w:p>
             <w:pPr>
               <w:spacing w:before="100" w:beforeAutospacing="1" w:after="100" w:afterAutospacing="1" w:line="240" w:lineRule="auto"/>
               <w:rPr>
                 <w:rFonts w:ascii="Arial" w:eastAsia="Times New Roman" w:hAnsi="Arial" w:cs="Arial"/>
-                <w:kern w:val="0"/>
-                <w:sz w:val="20"/>
-                <w:szCs w:val="20"/>
-                <w:lang w:eastAsia="fr-FR"/>
-                <w14:ligatures w14:val="none"/>
-              </w:rPr>
-            </w:pPr>
-            <w:r>
-              <w:rPr>
-                <w:rFonts w:ascii="Arial" w:eastAsia="Times New Roman" w:hAnsi="Arial" w:cs="Arial"/>
                 <w:b/>
                 <w:bCs/>
                 <w:kern w:val="0"/>
@@ -3475,16 +3173,27 @@
                 <w:lang w:eastAsia="fr-FR"/>
                 <w14:ligatures w14:val="none"/>
               </w:rPr>
+            </w:pPr>
+            <w:r>
+              <w:rPr>
+                <w:rFonts w:ascii="Arial" w:eastAsia="Times New Roman" w:hAnsi="Arial" w:cs="Arial"/>
+                <w:b/>
+                <w:bCs/>
+                <w:kern w:val="0"/>
+                <w:sz w:val="20"/>
+                <w:szCs w:val="20"/>
+                <w:lang w:eastAsia="fr-FR"/>
+                <w14:ligatures w14:val="none"/>
+              </w:rPr>
               <w:lastRenderedPageBreak/>
-              <w:t>GET</w:t>
+              <w:t>PUT</w:t>
             </w:r>
           </w:p>
         </w:tc>
         <w:tc>
           <w:tcPr>
-            <w:tcW w:w="7044" w:type="dxa"/>
+            <w:tcW w:w="5506" w:type="dxa"/>
             <w:vAlign w:val="center"/>
-            <w:hideMark/>
           </w:tcPr>
           <w:p>
             <w:pPr>
@@ -3554,7 +3263,6 @@
               </w:rPr>
               <w:t>{</w:t>
             </w:r>
-            <w:proofErr w:type="spellStart"/>
             <w:proofErr w:type="gramEnd"/>
             <w:r>
               <w:rPr>
@@ -3579,7 +3287,6 @@
               </w:rPr>
               <w:t>reunion</w:t>
             </w:r>
-            <w:proofErr w:type="spellEnd"/>
             <w:r>
               <w:rPr>
                 <w:rFonts w:ascii="Arial" w:eastAsia="Times New Roman" w:hAnsi="Arial" w:cs="Arial"/>
@@ -3591,7 +3298,6 @@
               </w:rPr>
               <w:t>}/</w:t>
             </w:r>
-            <w:proofErr w:type="spellStart"/>
             <w:proofErr w:type="gramEnd"/>
             <w:r>
               <w:rPr>
@@ -3602,27 +3308,152 @@
                 <w:lang w:eastAsia="fr-FR"/>
                 <w14:ligatures w14:val="none"/>
               </w:rPr>
-              <w:t>record</w:t>
-            </w:r>
-            <w:r>
-              <w:rPr>
-                <w:rFonts w:ascii="Arial" w:eastAsia="Times New Roman" w:hAnsi="Arial" w:cs="Arial"/>
-                <w:kern w:val="0"/>
-                <w:sz w:val="20"/>
-                <w:szCs w:val="20"/>
-                <w:lang w:eastAsia="fr-FR"/>
-                <w14:ligatures w14:val="none"/>
-              </w:rPr>
-              <w:t>_file</w:t>
-            </w:r>
-            <w:proofErr w:type="spellEnd"/>
+              <w:t>segment</w:t>
+            </w:r>
+            <w:proofErr w:type="gramStart"/>
+            <w:r>
+              <w:rPr>
+                <w:rFonts w:ascii="Arial" w:eastAsia="Times New Roman" w:hAnsi="Arial" w:cs="Arial"/>
+                <w:kern w:val="0"/>
+                <w:sz w:val="20"/>
+                <w:szCs w:val="20"/>
+                <w:lang w:eastAsia="fr-FR"/>
+                <w14:ligatures w14:val="none"/>
+              </w:rPr>
+              <w:t>/</w:t>
+            </w:r>
+            <w:r>
+              <w:rPr>
+                <w:rFonts w:ascii="Arial" w:eastAsia="Times New Roman" w:hAnsi="Arial" w:cs="Arial"/>
+                <w:kern w:val="0"/>
+                <w:sz w:val="20"/>
+                <w:szCs w:val="20"/>
+                <w:lang w:eastAsia="fr-FR"/>
+                <w14:ligatures w14:val="none"/>
+              </w:rPr>
+              <w:t>:</w:t>
+            </w:r>
+            <w:r>
+              <w:rPr>
+                <w:rFonts w:ascii="Arial" w:eastAsia="Times New Roman" w:hAnsi="Arial" w:cs="Arial"/>
+                <w:kern w:val="0"/>
+                <w:sz w:val="20"/>
+                <w:szCs w:val="20"/>
+                <w:lang w:eastAsia="fr-FR"/>
+                <w14:ligatures w14:val="none"/>
+              </w:rPr>
+              <w:t>{</w:t>
+            </w:r>
+            <w:proofErr w:type="gramEnd"/>
+            <w:r>
+              <w:rPr>
+                <w:rFonts w:ascii="Arial" w:eastAsia="Times New Roman" w:hAnsi="Arial" w:cs="Arial"/>
+                <w:kern w:val="0"/>
+                <w:sz w:val="20"/>
+                <w:szCs w:val="20"/>
+                <w:lang w:eastAsia="fr-FR"/>
+                <w14:ligatures w14:val="none"/>
+              </w:rPr>
+              <w:t>Id_</w:t>
+            </w:r>
+            <w:proofErr w:type="gramStart"/>
+            <w:r>
+              <w:rPr>
+                <w:rFonts w:ascii="Arial" w:eastAsia="Times New Roman" w:hAnsi="Arial" w:cs="Arial"/>
+                <w:kern w:val="0"/>
+                <w:sz w:val="20"/>
+                <w:szCs w:val="20"/>
+                <w:lang w:eastAsia="fr-FR"/>
+                <w14:ligatures w14:val="none"/>
+              </w:rPr>
+              <w:t>segment</w:t>
+            </w:r>
+            <w:r>
+              <w:rPr>
+                <w:rFonts w:ascii="Arial" w:eastAsia="Times New Roman" w:hAnsi="Arial" w:cs="Arial"/>
+                <w:kern w:val="0"/>
+                <w:sz w:val="20"/>
+                <w:szCs w:val="20"/>
+                <w:lang w:eastAsia="fr-FR"/>
+                <w14:ligatures w14:val="none"/>
+              </w:rPr>
+              <w:t>}/</w:t>
+            </w:r>
+            <w:proofErr w:type="gramEnd"/>
+            <w:r>
+              <w:rPr>
+                <w:rFonts w:ascii="Arial" w:eastAsia="Times New Roman" w:hAnsi="Arial" w:cs="Arial"/>
+                <w:kern w:val="0"/>
+                <w:sz w:val="20"/>
+                <w:szCs w:val="20"/>
+                <w:lang w:eastAsia="fr-FR"/>
+                <w14:ligatures w14:val="none"/>
+              </w:rPr>
+              <w:t>locuteur</w:t>
+            </w:r>
+            <w:proofErr w:type="gramStart"/>
+            <w:r>
+              <w:rPr>
+                <w:rFonts w:ascii="Arial" w:eastAsia="Times New Roman" w:hAnsi="Arial" w:cs="Arial"/>
+                <w:kern w:val="0"/>
+                <w:sz w:val="20"/>
+                <w:szCs w:val="20"/>
+                <w:lang w:eastAsia="fr-FR"/>
+                <w14:ligatures w14:val="none"/>
+              </w:rPr>
+              <w:t>/</w:t>
+            </w:r>
+            <w:r>
+              <w:rPr>
+                <w:rFonts w:ascii="Arial" w:eastAsia="Times New Roman" w:hAnsi="Arial" w:cs="Arial"/>
+                <w:kern w:val="0"/>
+                <w:sz w:val="20"/>
+                <w:szCs w:val="20"/>
+                <w:lang w:eastAsia="fr-FR"/>
+                <w14:ligatures w14:val="none"/>
+              </w:rPr>
+              <w:t>:</w:t>
+            </w:r>
+            <w:r>
+              <w:rPr>
+                <w:rFonts w:ascii="Arial" w:eastAsia="Times New Roman" w:hAnsi="Arial" w:cs="Arial"/>
+                <w:kern w:val="0"/>
+                <w:sz w:val="20"/>
+                <w:szCs w:val="20"/>
+                <w:lang w:eastAsia="fr-FR"/>
+                <w14:ligatures w14:val="none"/>
+              </w:rPr>
+              <w:t>{</w:t>
+            </w:r>
+            <w:proofErr w:type="gramEnd"/>
+            <w:r>
+              <w:rPr>
+                <w:rFonts w:ascii="Arial" w:eastAsia="Times New Roman" w:hAnsi="Arial" w:cs="Arial"/>
+                <w:kern w:val="0"/>
+                <w:sz w:val="20"/>
+                <w:szCs w:val="20"/>
+                <w:lang w:eastAsia="fr-FR"/>
+                <w14:ligatures w14:val="none"/>
+              </w:rPr>
+              <w:t>Id_participant</w:t>
+            </w:r>
+            <w:r>
+              <w:rPr>
+                <w:rFonts w:ascii="Arial" w:eastAsia="Times New Roman" w:hAnsi="Arial" w:cs="Arial"/>
+                <w:kern w:val="0"/>
+                <w:sz w:val="20"/>
+                <w:szCs w:val="20"/>
+                <w:lang w:eastAsia="fr-FR"/>
+                <w14:ligatures w14:val="none"/>
+              </w:rPr>
+              <w:t>}</w:t>
+            </w:r>
           </w:p>
         </w:tc>
         <w:tc>
           <w:tcPr>
-            <w:tcW w:w="1671" w:type="dxa"/>
+            <w:tcW w:w="1398" w:type="dxa"/>
             <w:vAlign w:val="center"/>
-            <w:hideMark/>
           </w:tcPr>
           <w:p>
             <w:pPr>
@@ -3645,35 +3476,13 @@
                 <w:lang w:eastAsia="fr-FR"/>
                 <w14:ligatures w14:val="none"/>
               </w:rPr>
-              <w:t xml:space="preserve">Récupérer </w:t>
-            </w:r>
-            <w:r>
-              <w:rPr>
-                <w:rFonts w:ascii="Arial" w:eastAsia="Times New Roman" w:hAnsi="Arial" w:cs="Arial"/>
-                <w:kern w:val="0"/>
-                <w:sz w:val="20"/>
-                <w:szCs w:val="20"/>
-                <w:lang w:eastAsia="fr-FR"/>
-                <w14:ligatures w14:val="none"/>
-              </w:rPr>
-              <w:t>pour</w:t>
-            </w:r>
-            <w:r>
-              <w:rPr>
-                <w:rFonts w:ascii="Arial" w:eastAsia="Times New Roman" w:hAnsi="Arial" w:cs="Arial"/>
-                <w:kern w:val="0"/>
-                <w:sz w:val="20"/>
-                <w:szCs w:val="20"/>
-                <w:lang w:eastAsia="fr-FR"/>
-                <w14:ligatures w14:val="none"/>
-              </w:rPr>
-              <w:t xml:space="preserve"> écouter l’audio de la réunion</w:t>
+              <w:t>Modifier le locuteur d’un segment défini par défaut par l’IA.</w:t>
             </w:r>
           </w:p>
         </w:tc>
         <w:tc>
           <w:tcPr>
-            <w:tcW w:w="1656" w:type="dxa"/>
+            <w:tcW w:w="1383" w:type="dxa"/>
             <w:vAlign w:val="center"/>
           </w:tcPr>
           <w:p>
@@ -3698,7 +3507,31 @@
                 <w:lang w:eastAsia="fr-FR"/>
                 <w14:ligatures w14:val="none"/>
               </w:rPr>
-              <w:t>200 + Record file</w:t>
+              <w:t xml:space="preserve">202 + </w:t>
+            </w:r>
+            <w:proofErr w:type="spellStart"/>
+            <w:r>
+              <w:rPr>
+                <w:rFonts w:ascii="Arial" w:eastAsia="Times New Roman" w:hAnsi="Arial" w:cs="Arial"/>
+                <w:kern w:val="0"/>
+                <w:sz w:val="20"/>
+                <w:szCs w:val="20"/>
+                <w:lang w:eastAsia="fr-FR"/>
+                <w14:ligatures w14:val="none"/>
+              </w:rPr>
+              <w:t>Modif</w:t>
+            </w:r>
+            <w:proofErr w:type="spellEnd"/>
+            <w:r>
+              <w:rPr>
+                <w:rFonts w:ascii="Arial" w:eastAsia="Times New Roman" w:hAnsi="Arial" w:cs="Arial"/>
+                <w:kern w:val="0"/>
+                <w:sz w:val="20"/>
+                <w:szCs w:val="20"/>
+                <w:lang w:eastAsia="fr-FR"/>
+                <w14:ligatures w14:val="none"/>
+              </w:rPr>
+              <w:t xml:space="preserve"> locuteur</w:t>
             </w:r>
           </w:p>
         </w:tc>
@@ -3709,16 +3542,15 @@
         </w:trPr>
         <w:tc>
           <w:tcPr>
-            <w:tcW w:w="531" w:type="dxa"/>
+            <w:tcW w:w="659" w:type="dxa"/>
             <w:vAlign w:val="center"/>
+            <w:hideMark/>
           </w:tcPr>
           <w:p>
             <w:pPr>
               <w:spacing w:before="100" w:beforeAutospacing="1" w:after="100" w:afterAutospacing="1" w:line="240" w:lineRule="auto"/>
               <w:rPr>
                 <w:rFonts w:ascii="Arial" w:eastAsia="Times New Roman" w:hAnsi="Arial" w:cs="Arial"/>
-                <w:b/>
-                <w:bCs/>
                 <w:kern w:val="0"/>
                 <w:sz w:val="20"/>
                 <w:szCs w:val="20"/>
@@ -3743,8 +3575,9 @@
         </w:tc>
         <w:tc>
           <w:tcPr>
-            <w:tcW w:w="7044" w:type="dxa"/>
+            <w:tcW w:w="5506" w:type="dxa"/>
             <w:vAlign w:val="center"/>
+            <w:hideMark/>
           </w:tcPr>
           <w:p>
             <w:pPr>
@@ -3814,6 +3647,7 @@
               </w:rPr>
               <w:t>{</w:t>
             </w:r>
+            <w:proofErr w:type="spellStart"/>
             <w:proofErr w:type="gramEnd"/>
             <w:r>
               <w:rPr>
@@ -3838,6 +3672,7 @@
               </w:rPr>
               <w:t>reunion</w:t>
             </w:r>
+            <w:proofErr w:type="spellEnd"/>
             <w:r>
               <w:rPr>
                 <w:rFonts w:ascii="Arial" w:eastAsia="Times New Roman" w:hAnsi="Arial" w:cs="Arial"/>
@@ -3849,6 +3684,7 @@
               </w:rPr>
               <w:t>}/</w:t>
             </w:r>
+            <w:proofErr w:type="spellStart"/>
             <w:proofErr w:type="gramEnd"/>
             <w:r>
               <w:rPr>
@@ -3859,62 +3695,27 @@
                 <w:lang w:eastAsia="fr-FR"/>
                 <w14:ligatures w14:val="none"/>
               </w:rPr>
-              <w:t>segment</w:t>
-            </w:r>
-            <w:proofErr w:type="gramStart"/>
-            <w:r>
-              <w:rPr>
-                <w:rFonts w:ascii="Arial" w:eastAsia="Times New Roman" w:hAnsi="Arial" w:cs="Arial"/>
-                <w:kern w:val="0"/>
-                <w:sz w:val="20"/>
-                <w:szCs w:val="20"/>
-                <w:lang w:eastAsia="fr-FR"/>
-                <w14:ligatures w14:val="none"/>
-              </w:rPr>
-              <w:t>/:{</w:t>
-            </w:r>
-            <w:proofErr w:type="gramEnd"/>
-            <w:r>
-              <w:rPr>
-                <w:rFonts w:ascii="Arial" w:eastAsia="Times New Roman" w:hAnsi="Arial" w:cs="Arial"/>
-                <w:kern w:val="0"/>
-                <w:sz w:val="20"/>
-                <w:szCs w:val="20"/>
-                <w:lang w:eastAsia="fr-FR"/>
-                <w14:ligatures w14:val="none"/>
-              </w:rPr>
-              <w:t>Id_</w:t>
-            </w:r>
-            <w:proofErr w:type="gramStart"/>
-            <w:r>
-              <w:rPr>
-                <w:rFonts w:ascii="Arial" w:eastAsia="Times New Roman" w:hAnsi="Arial" w:cs="Arial"/>
-                <w:kern w:val="0"/>
-                <w:sz w:val="20"/>
-                <w:szCs w:val="20"/>
-                <w:lang w:eastAsia="fr-FR"/>
-                <w14:ligatures w14:val="none"/>
-              </w:rPr>
-              <w:t>segment}/</w:t>
-            </w:r>
-            <w:proofErr w:type="gramEnd"/>
-            <w:r>
-              <w:rPr>
-                <w:rFonts w:ascii="Arial" w:eastAsia="Times New Roman" w:hAnsi="Arial" w:cs="Arial"/>
-                <w:kern w:val="0"/>
-                <w:sz w:val="20"/>
-                <w:szCs w:val="20"/>
-                <w:lang w:eastAsia="fr-FR"/>
-                <w14:ligatures w14:val="none"/>
-              </w:rPr>
-              <w:t>time_depart</w:t>
-            </w:r>
+              <w:t>record</w:t>
+            </w:r>
+            <w:r>
+              <w:rPr>
+                <w:rFonts w:ascii="Arial" w:eastAsia="Times New Roman" w:hAnsi="Arial" w:cs="Arial"/>
+                <w:kern w:val="0"/>
+                <w:sz w:val="20"/>
+                <w:szCs w:val="20"/>
+                <w:lang w:eastAsia="fr-FR"/>
+                <w14:ligatures w14:val="none"/>
+              </w:rPr>
+              <w:t>_file</w:t>
+            </w:r>
+            <w:proofErr w:type="spellEnd"/>
           </w:p>
         </w:tc>
         <w:tc>
           <w:tcPr>
-            <w:tcW w:w="1671" w:type="dxa"/>
+            <w:tcW w:w="1398" w:type="dxa"/>
             <w:vAlign w:val="center"/>
+            <w:hideMark/>
           </w:tcPr>
           <w:p>
             <w:pPr>
@@ -3937,13 +3738,35 @@
                 <w:lang w:eastAsia="fr-FR"/>
                 <w14:ligatures w14:val="none"/>
               </w:rPr>
-              <w:t>Obtenir date démarrage d’enregistrement du segment pour trouver l’audio correspondant</w:t>
+              <w:t xml:space="preserve">Récupérer </w:t>
+            </w:r>
+            <w:r>
+              <w:rPr>
+                <w:rFonts w:ascii="Arial" w:eastAsia="Times New Roman" w:hAnsi="Arial" w:cs="Arial"/>
+                <w:kern w:val="0"/>
+                <w:sz w:val="20"/>
+                <w:szCs w:val="20"/>
+                <w:lang w:eastAsia="fr-FR"/>
+                <w14:ligatures w14:val="none"/>
+              </w:rPr>
+              <w:t>pour</w:t>
+            </w:r>
+            <w:r>
+              <w:rPr>
+                <w:rFonts w:ascii="Arial" w:eastAsia="Times New Roman" w:hAnsi="Arial" w:cs="Arial"/>
+                <w:kern w:val="0"/>
+                <w:sz w:val="20"/>
+                <w:szCs w:val="20"/>
+                <w:lang w:eastAsia="fr-FR"/>
+                <w14:ligatures w14:val="none"/>
+              </w:rPr>
+              <w:t xml:space="preserve"> écouter l’audio de la réunion</w:t>
             </w:r>
           </w:p>
         </w:tc>
         <w:tc>
           <w:tcPr>
-            <w:tcW w:w="1656" w:type="dxa"/>
+            <w:tcW w:w="1383" w:type="dxa"/>
             <w:vAlign w:val="center"/>
           </w:tcPr>
           <w:p>
@@ -3968,7 +3791,7 @@
                 <w:lang w:eastAsia="fr-FR"/>
                 <w14:ligatures w14:val="none"/>
               </w:rPr>
-              <w:t>200 + Temps départ segment</w:t>
+              <w:t>200 + Record file</w:t>
             </w:r>
           </w:p>
         </w:tc>
@@ -3979,7 +3802,7 @@
         </w:trPr>
         <w:tc>
           <w:tcPr>
-            <w:tcW w:w="531" w:type="dxa"/>
+            <w:tcW w:w="659" w:type="dxa"/>
             <w:vAlign w:val="center"/>
           </w:tcPr>
           <w:p>
@@ -4013,7 +3836,7 @@
         </w:tc>
         <w:tc>
           <w:tcPr>
-            <w:tcW w:w="7044" w:type="dxa"/>
+            <w:tcW w:w="5506" w:type="dxa"/>
             <w:vAlign w:val="center"/>
           </w:tcPr>
           <w:p>
@@ -4084,7 +3907,6 @@
               </w:rPr>
               <w:t>{</w:t>
             </w:r>
-            <w:proofErr w:type="spellStart"/>
             <w:proofErr w:type="gramEnd"/>
             <w:r>
               <w:rPr>
@@ -4109,7 +3931,6 @@
               </w:rPr>
               <w:t>reunion</w:t>
             </w:r>
-            <w:proofErr w:type="spellEnd"/>
             <w:r>
               <w:rPr>
                 <w:rFonts w:ascii="Arial" w:eastAsia="Times New Roman" w:hAnsi="Arial" w:cs="Arial"/>
@@ -4145,7 +3966,6 @@
               </w:rPr>
               <w:t>/:{</w:t>
             </w:r>
-            <w:proofErr w:type="spellStart"/>
             <w:proofErr w:type="gramEnd"/>
             <w:r>
               <w:rPr>
@@ -4168,21 +3988,8 @@
                 <w:lang w:eastAsia="fr-FR"/>
                 <w14:ligatures w14:val="none"/>
               </w:rPr>
-              <w:t>segment</w:t>
-            </w:r>
-            <w:proofErr w:type="spellEnd"/>
-            <w:r>
-              <w:rPr>
-                <w:rFonts w:ascii="Arial" w:eastAsia="Times New Roman" w:hAnsi="Arial" w:cs="Arial"/>
-                <w:kern w:val="0"/>
-                <w:sz w:val="20"/>
-                <w:szCs w:val="20"/>
-                <w:lang w:eastAsia="fr-FR"/>
-                <w14:ligatures w14:val="none"/>
-              </w:rPr>
-              <w:t>}/</w:t>
-            </w:r>
-            <w:proofErr w:type="spellStart"/>
+              <w:t>segment}/</w:t>
+            </w:r>
             <w:proofErr w:type="gramEnd"/>
             <w:r>
               <w:rPr>
@@ -4193,14 +4000,13 @@
                 <w:lang w:eastAsia="fr-FR"/>
                 <w14:ligatures w14:val="none"/>
               </w:rPr>
-              <w:t>time_fin</w:t>
-            </w:r>
-            <w:proofErr w:type="spellEnd"/>
+              <w:t>time_depart</w:t>
+            </w:r>
           </w:p>
         </w:tc>
         <w:tc>
           <w:tcPr>
-            <w:tcW w:w="1671" w:type="dxa"/>
+            <w:tcW w:w="1398" w:type="dxa"/>
             <w:vAlign w:val="center"/>
           </w:tcPr>
           <w:p>
@@ -4224,13 +4030,13 @@
                 <w:lang w:eastAsia="fr-FR"/>
                 <w14:ligatures w14:val="none"/>
               </w:rPr>
-              <w:t>Obtenir date de fin d’enregistrement du segment pour trouver l’audio correspondant</w:t>
+              <w:t>Obtenir date démarrage d’enregistrement du segment pour trouver l’audio correspondant</w:t>
             </w:r>
           </w:p>
         </w:tc>
         <w:tc>
           <w:tcPr>
-            <w:tcW w:w="1656" w:type="dxa"/>
+            <w:tcW w:w="1383" w:type="dxa"/>
             <w:vAlign w:val="center"/>
           </w:tcPr>
           <w:p>
@@ -4255,29 +4061,294 @@
                 <w:lang w:eastAsia="fr-FR"/>
                 <w14:ligatures w14:val="none"/>
               </w:rPr>
-              <w:t xml:space="preserve">200 + Temps </w:t>
-            </w:r>
-            <w:r>
-              <w:rPr>
-                <w:rFonts w:ascii="Arial" w:eastAsia="Times New Roman" w:hAnsi="Arial" w:cs="Arial"/>
-                <w:kern w:val="0"/>
-                <w:sz w:val="20"/>
-                <w:szCs w:val="20"/>
-                <w:lang w:eastAsia="fr-FR"/>
-                <w14:ligatures w14:val="none"/>
-              </w:rPr>
-              <w:t>fin</w:t>
-            </w:r>
-            <w:r>
-              <w:rPr>
-                <w:rFonts w:ascii="Arial" w:eastAsia="Times New Roman" w:hAnsi="Arial" w:cs="Arial"/>
-                <w:kern w:val="0"/>
-                <w:sz w:val="20"/>
-                <w:szCs w:val="20"/>
-                <w:lang w:eastAsia="fr-FR"/>
-                <w14:ligatures w14:val="none"/>
-              </w:rPr>
-              <w:t xml:space="preserve"> segment</w:t>
+              <w:t>200 + Temps départ segment</w:t>
+            </w:r>
+          </w:p>
+        </w:tc>
+      </w:tr>
+      <w:tr>
+        <w:trPr>
+          <w:tblCellSpacing w:w="15" w:type="dxa"/>
+        </w:trPr>
+        <w:tc>
+          <w:tcPr>
+            <w:tcW w:w="659" w:type="dxa"/>
+            <w:vAlign w:val="center"/>
+          </w:tcPr>
+          <w:p>
+            <w:pPr>
+              <w:spacing w:before="100" w:beforeAutospacing="1" w:after="100" w:afterAutospacing="1" w:line="240" w:lineRule="auto"/>
+              <w:rPr>
+                <w:rFonts w:ascii="Arial" w:eastAsia="Times New Roman" w:hAnsi="Arial" w:cs="Arial"/>
+                <w:b/>
+                <w:bCs/>
+                <w:kern w:val="0"/>
+                <w:sz w:val="20"/>
+                <w:szCs w:val="20"/>
+                <w:lang w:eastAsia="fr-FR"/>
+                <w14:ligatures w14:val="none"/>
+              </w:rPr>
+            </w:pPr>
+            <w:r>
+              <w:rPr>
+                <w:rFonts w:ascii="Arial" w:eastAsia="Times New Roman" w:hAnsi="Arial" w:cs="Arial"/>
+                <w:b/>
+                <w:bCs/>
+                <w:kern w:val="0"/>
+                <w:sz w:val="20"/>
+                <w:szCs w:val="20"/>
+                <w:lang w:eastAsia="fr-FR"/>
+                <w14:ligatures w14:val="none"/>
+              </w:rPr>
+              <w:t>GET</w:t>
+            </w:r>
+          </w:p>
+        </w:tc>
+        <w:tc>
+          <w:tcPr>
+            <w:tcW w:w="5506" w:type="dxa"/>
+            <w:vAlign w:val="center"/>
+          </w:tcPr>
+          <w:p>
+            <w:pPr>
+              <w:spacing w:before="100" w:beforeAutospacing="1" w:after="100" w:afterAutospacing="1" w:line="240" w:lineRule="auto"/>
+              <w:rPr>
+                <w:rFonts w:ascii="Arial" w:eastAsia="Times New Roman" w:hAnsi="Arial" w:cs="Arial"/>
+                <w:kern w:val="0"/>
+                <w:sz w:val="20"/>
+                <w:szCs w:val="20"/>
+                <w:lang w:eastAsia="fr-FR"/>
+                <w14:ligatures w14:val="none"/>
+              </w:rPr>
+            </w:pPr>
+            <w:r>
+              <w:rPr>
+                <w:rFonts w:ascii="Arial" w:eastAsia="Times New Roman" w:hAnsi="Arial" w:cs="Arial"/>
+                <w:kern w:val="0"/>
+                <w:sz w:val="20"/>
+                <w:szCs w:val="20"/>
+                <w:lang w:eastAsia="fr-FR"/>
+                <w14:ligatures w14:val="none"/>
+              </w:rPr>
+              <w:t>/api</w:t>
+            </w:r>
+            <w:r>
+              <w:rPr>
+                <w:rFonts w:ascii="Arial" w:eastAsia="Times New Roman" w:hAnsi="Arial" w:cs="Arial"/>
+                <w:kern w:val="0"/>
+                <w:sz w:val="20"/>
+                <w:szCs w:val="20"/>
+                <w:lang w:eastAsia="fr-FR"/>
+                <w14:ligatures w14:val="none"/>
+              </w:rPr>
+              <w:t>/transcription</w:t>
+            </w:r>
+            <w:proofErr w:type="gramStart"/>
+            <w:r>
+              <w:rPr>
+                <w:rFonts w:ascii="Arial" w:eastAsia="Times New Roman" w:hAnsi="Arial" w:cs="Arial"/>
+                <w:kern w:val="0"/>
+                <w:sz w:val="20"/>
+                <w:szCs w:val="20"/>
+                <w:lang w:eastAsia="fr-FR"/>
+                <w14:ligatures w14:val="none"/>
+              </w:rPr>
+              <w:t>/</w:t>
+            </w:r>
+            <w:r>
+              <w:rPr>
+                <w:rFonts w:ascii="Arial" w:eastAsia="Times New Roman" w:hAnsi="Arial" w:cs="Arial"/>
+                <w:kern w:val="0"/>
+                <w:sz w:val="20"/>
+                <w:szCs w:val="20"/>
+                <w:lang w:eastAsia="fr-FR"/>
+                <w14:ligatures w14:val="none"/>
+              </w:rPr>
+              <w:t>:</w:t>
+            </w:r>
+            <w:r>
+              <w:rPr>
+                <w:rFonts w:ascii="Arial" w:eastAsia="Times New Roman" w:hAnsi="Arial" w:cs="Arial"/>
+                <w:kern w:val="0"/>
+                <w:sz w:val="20"/>
+                <w:szCs w:val="20"/>
+                <w:lang w:eastAsia="fr-FR"/>
+                <w14:ligatures w14:val="none"/>
+              </w:rPr>
+              <w:t>{</w:t>
+            </w:r>
+            <w:proofErr w:type="spellStart"/>
+            <w:proofErr w:type="gramEnd"/>
+            <w:r>
+              <w:rPr>
+                <w:rFonts w:ascii="Arial" w:eastAsia="Times New Roman" w:hAnsi="Arial" w:cs="Arial"/>
+                <w:kern w:val="0"/>
+                <w:sz w:val="20"/>
+                <w:szCs w:val="20"/>
+                <w:lang w:eastAsia="fr-FR"/>
+                <w14:ligatures w14:val="none"/>
+              </w:rPr>
+              <w:t>Id_</w:t>
+            </w:r>
+            <w:proofErr w:type="gramStart"/>
+            <w:r>
+              <w:rPr>
+                <w:rFonts w:ascii="Arial" w:eastAsia="Times New Roman" w:hAnsi="Arial" w:cs="Arial"/>
+                <w:kern w:val="0"/>
+                <w:sz w:val="20"/>
+                <w:szCs w:val="20"/>
+                <w:lang w:eastAsia="fr-FR"/>
+                <w14:ligatures w14:val="none"/>
+              </w:rPr>
+              <w:t>reunion</w:t>
+            </w:r>
+            <w:proofErr w:type="spellEnd"/>
+            <w:r>
+              <w:rPr>
+                <w:rFonts w:ascii="Arial" w:eastAsia="Times New Roman" w:hAnsi="Arial" w:cs="Arial"/>
+                <w:kern w:val="0"/>
+                <w:sz w:val="20"/>
+                <w:szCs w:val="20"/>
+                <w:lang w:eastAsia="fr-FR"/>
+                <w14:ligatures w14:val="none"/>
+              </w:rPr>
+              <w:t>}/</w:t>
+            </w:r>
+            <w:proofErr w:type="gramEnd"/>
+            <w:r>
+              <w:rPr>
+                <w:rFonts w:ascii="Arial" w:eastAsia="Times New Roman" w:hAnsi="Arial" w:cs="Arial"/>
+                <w:kern w:val="0"/>
+                <w:sz w:val="20"/>
+                <w:szCs w:val="20"/>
+                <w:lang w:eastAsia="fr-FR"/>
+                <w14:ligatures w14:val="none"/>
+              </w:rPr>
+              <w:t>segment</w:t>
+            </w:r>
+            <w:proofErr w:type="gramStart"/>
+            <w:r>
+              <w:rPr>
+                <w:rFonts w:ascii="Arial" w:eastAsia="Times New Roman" w:hAnsi="Arial" w:cs="Arial"/>
+                <w:kern w:val="0"/>
+                <w:sz w:val="20"/>
+                <w:szCs w:val="20"/>
+                <w:lang w:eastAsia="fr-FR"/>
+                <w14:ligatures w14:val="none"/>
+              </w:rPr>
+              <w:t>/:{</w:t>
+            </w:r>
+            <w:proofErr w:type="spellStart"/>
+            <w:proofErr w:type="gramEnd"/>
+            <w:r>
+              <w:rPr>
+                <w:rFonts w:ascii="Arial" w:eastAsia="Times New Roman" w:hAnsi="Arial" w:cs="Arial"/>
+                <w:kern w:val="0"/>
+                <w:sz w:val="20"/>
+                <w:szCs w:val="20"/>
+                <w:lang w:eastAsia="fr-FR"/>
+                <w14:ligatures w14:val="none"/>
+              </w:rPr>
+              <w:t>Id_</w:t>
+            </w:r>
+            <w:proofErr w:type="gramStart"/>
+            <w:r>
+              <w:rPr>
+                <w:rFonts w:ascii="Arial" w:eastAsia="Times New Roman" w:hAnsi="Arial" w:cs="Arial"/>
+                <w:kern w:val="0"/>
+                <w:sz w:val="20"/>
+                <w:szCs w:val="20"/>
+                <w:lang w:eastAsia="fr-FR"/>
+                <w14:ligatures w14:val="none"/>
+              </w:rPr>
+              <w:t>segment</w:t>
+            </w:r>
+            <w:proofErr w:type="spellEnd"/>
+            <w:r>
+              <w:rPr>
+                <w:rFonts w:ascii="Arial" w:eastAsia="Times New Roman" w:hAnsi="Arial" w:cs="Arial"/>
+                <w:kern w:val="0"/>
+                <w:sz w:val="20"/>
+                <w:szCs w:val="20"/>
+                <w:lang w:eastAsia="fr-FR"/>
+                <w14:ligatures w14:val="none"/>
+              </w:rPr>
+              <w:t>}/</w:t>
+            </w:r>
+            <w:proofErr w:type="spellStart"/>
+            <w:proofErr w:type="gramEnd"/>
+            <w:r>
+              <w:rPr>
+                <w:rFonts w:ascii="Arial" w:eastAsia="Times New Roman" w:hAnsi="Arial" w:cs="Arial"/>
+                <w:kern w:val="0"/>
+                <w:sz w:val="20"/>
+                <w:szCs w:val="20"/>
+                <w:lang w:eastAsia="fr-FR"/>
+                <w14:ligatures w14:val="none"/>
+              </w:rPr>
+              <w:t>time_fin</w:t>
+            </w:r>
+            <w:proofErr w:type="spellEnd"/>
+          </w:p>
+        </w:tc>
+        <w:tc>
+          <w:tcPr>
+            <w:tcW w:w="1398" w:type="dxa"/>
+            <w:vAlign w:val="center"/>
+          </w:tcPr>
+          <w:p>
+            <w:pPr>
+              <w:spacing w:before="100" w:beforeAutospacing="1" w:after="100" w:afterAutospacing="1" w:line="240" w:lineRule="auto"/>
+              <w:rPr>
+                <w:rFonts w:ascii="Arial" w:eastAsia="Times New Roman" w:hAnsi="Arial" w:cs="Arial"/>
+                <w:kern w:val="0"/>
+                <w:sz w:val="20"/>
+                <w:szCs w:val="20"/>
+                <w:lang w:eastAsia="fr-FR"/>
+                <w14:ligatures w14:val="none"/>
+              </w:rPr>
+            </w:pPr>
+            <w:r>
+              <w:rPr>
+                <w:rFonts w:ascii="Arial" w:eastAsia="Times New Roman" w:hAnsi="Arial" w:cs="Arial"/>
+                <w:kern w:val="0"/>
+                <w:sz w:val="20"/>
+                <w:szCs w:val="20"/>
+                <w:lang w:eastAsia="fr-FR"/>
+                <w14:ligatures w14:val="none"/>
+              </w:rPr>
+              <w:t>Obtenir date de fin d’enregistrement du segment pour trouver l’audio correspondant</w:t>
+            </w:r>
+          </w:p>
+        </w:tc>
+        <w:tc>
+          <w:tcPr>
+            <w:tcW w:w="1383" w:type="dxa"/>
+            <w:vAlign w:val="center"/>
+          </w:tcPr>
+          <w:p>
+            <w:pPr>
+              <w:spacing w:before="100" w:beforeAutospacing="1" w:after="100" w:afterAutospacing="1" w:line="240" w:lineRule="auto"/>
+              <w:jc w:val="center"/>
+              <w:rPr>
+                <w:rFonts w:ascii="Arial" w:eastAsia="Times New Roman" w:hAnsi="Arial" w:cs="Arial"/>
+                <w:kern w:val="0"/>
+                <w:sz w:val="20"/>
+                <w:szCs w:val="20"/>
+                <w:lang w:eastAsia="fr-FR"/>
+                <w14:ligatures w14:val="none"/>
+              </w:rPr>
+            </w:pPr>
+            <w:r>
+              <w:rPr>
+                <w:rFonts w:ascii="Arial" w:eastAsia="Times New Roman" w:hAnsi="Arial" w:cs="Arial"/>
+                <w:kern w:val="0"/>
+                <w:sz w:val="20"/>
+                <w:szCs w:val="20"/>
+                <w:lang w:eastAsia="fr-FR"/>
+                <w14:ligatures w14:val="none"/>
+              </w:rPr>
+              <w:t>200 + Temps fin segment</w:t>
             </w:r>
           </w:p>
         </w:tc>

</xml_diff>